<commit_message>
Muldoon: indent the Achillea passage with the requested line breaks
Co-Authored-By: Claude Sonnet 5.5 <noreply@anthropic.com>
</commit_message>
<xml_diff>
--- a/content-src/docx/I G 2001 05 12 Muldoon.docx
+++ b/content-src/docx/I G 2001 05 12 Muldoon.docx
@@ -509,47 +509,53 @@
     </w:p>
     <w:p>
       <w:r>
+        <w:t xml:space="preserve">&lt;quote&gt;</w:t>
+      </w:r>
+      <w:r>
         <w:rPr>
           <w:i/>
           <w:iCs/>
         </w:rPr>
-        <w:t>Achillea millefolium</w:t>
-      </w:r>
-      <w:r>
-        <w:t>: with its</w:t>
+        <w:t xml:space="preserve">Achillea millefolium</w:t>
+      </w:r>
+      <w:r>
+        <w:t xml:space="preserve">: with its bedraggled, feathery leaf</w:t>
       </w:r>
       <w:r>
         <w:br/>
-        <w:t>bedraggled, feathery leaf</w:t>
+      </w:r>
+      <w:r>
+        <w:t xml:space="preserve">and pink (less red</w:t>
       </w:r>
       <w:r>
         <w:br/>
-        <w:t>and pink (less red than mauve) or off-white</w:t>
+      </w:r>
+      <w:r>
+        <w:t xml:space="preserve">than mauve) or off-white flower, its tight little knot</w:t>
       </w:r>
       <w:r>
         <w:br/>
-        <w:t>flower, its tight little knot</w:t>
-      </w:r>
-    </w:p>
-    <w:p>
-      <w:r>
-        <w:t>of a head,</w:t>
       </w:r>
       <w:r>
         <w:br/>
-        <w:t>it's like something keeping a</w:t>
+      </w:r>
+      <w:r>
+        <w:t xml:space="preserve">of a head,</w:t>
       </w:r>
       <w:r>
         <w:br/>
-        <w:t>secret</w:t>
+      </w:r>
+      <w:r>
+        <w:t xml:space="preserve">it's like something keeping a secret</w:t>
       </w:r>
       <w:r>
         <w:br/>
-        <w:t>from itself, something on the</w:t>
-      </w:r>
-      <w:r>
-        <w:br/>
-        <w:t>tip of its own tongue.</w:t>
+      </w:r>
+      <w:r>
+        <w:t xml:space="preserve">from itself, something on the tip of its own tongue.</w:t>
+      </w:r>
+      <w:r>
+        <w:t xml:space="preserve">&lt;/quote&gt;</w:t>
       </w:r>
     </w:p>
     <w:p>

</xml_diff>